<commit_message>
Print Layout view in all Word files; landscape full-SEM diagrams (all items, standardized loadings and paths, English labels) for the new papers
Co-Authored-By: Claude Sonnet 5.5 <noreply@anthropic.com>
Claude-Session: https://claude.ai/code/session_01B6hBNJS5eMNFXmCvfzEnc8
</commit_message>
<xml_diff>
--- a/ethics_paper/deliverables/Paper_FA_Auditor_Silence.docx
+++ b/ethics_paper/deliverables/Paper_FA_Auditor_Silence.docx
@@ -5906,13 +5906,23 @@
     </w:p>
     <w:p>
       <w:pPr>
+        <w:sectPr>
+          <w:footerReference w:type="default" r:id="rIdFooter"/>
+          <w:pgSz w:w="11906" w:h="16838"/>
+          <w:pgMar w:top="1417" w:right="1417" w:bottom="1417" w:left="1417" w:header="708" w:footer="708" w:gutter="0"/>
+          <w:bidi/>
+        </w:sectPr>
+      </w:pPr>
+    </w:p>
+    <w:p>
+      <w:pPr>
         <w:keepNext/>
         <w:jc w:val="center"/>
       </w:pPr>
       <w:r>
         <w:drawing>
           <wp:inline distT="0" distB="0" distL="0" distR="0">
-            <wp:extent cx="5580000" cy="3058269"/>
+            <wp:extent cx="8460000" cy="5856923"/>
             <wp:docPr id="2" name="Figure 2"/>
             <a:graphic xmlns:a="http://schemas.openxmlformats.org/drawingml/2006/main">
               <a:graphicData uri="http://schemas.openxmlformats.org/drawingml/2006/picture">
@@ -5930,7 +5940,7 @@
                   <pic:spPr>
                     <a:xfrm>
                       <a:off x="0" y="0"/>
-                      <a:ext cx="5580000" cy="3058269"/>
+                      <a:ext cx="8460000" cy="5856923"/>
                     </a:xfrm>
                     <a:prstGeom prst="rect">
                       <a:avLst/>
@@ -5958,8 +5968,18 @@
           <w:szCs w:val="20"/>
           <w:lang w:val="en-US" w:bidi="fa-IR"/>
         </w:rPr>
-        <w:t xml:space="preserve">شکل ۲. مدل برآوردشده (ضرایب استاندارد؛ ∗ معنادار در سطح ۰٫۰۵، ∗∗ سطح ۰٫۰۱، ∗∗∗ سطح ۰٫۰۰۱)</w:t>
-      </w:r>
+        <w:t xml:space="preserve">شکل ۲. مدل برآوردشده با همهٔ گویه‌ها: بارهای عاملی استاندارد (λ) و ضرایب مسیر استاندارد (β) (∗ p&lt;۰٫۰۵، ∗∗ p&lt;۰٫۰۱، ∗∗∗ p&lt;۰٫۰۰۱)</w:t>
+      </w:r>
+    </w:p>
+    <w:p>
+      <w:pPr>
+        <w:sectPr>
+          <w:footerReference w:type="default" r:id="rIdFooter"/>
+          <w:pgSz w:w="16838" w:h="11906" w:orient="landscape"/>
+          <w:pgMar w:top="1000" w:right="1000" w:bottom="1000" w:left="1000" w:header="708" w:footer="708" w:gutter="0"/>
+          <w:bidi/>
+        </w:sectPr>
+      </w:pPr>
     </w:p>
     <w:p>
       <w:pPr>

</xml_diff>